<commit_message>
Date du document éditable, préremplie à la date du jour
- Remplace le champ date automatique Word (en-tête) par une balise
  {date_document} dans le modèle (versions Choice + Fallback)
- Nouveau champ « Date du document » dans le formulaire, prérempli à la
  date du jour au format long FR (ex. 17 juillet 2026) et modifiable
  avant génération
- La date retenue est archivée et affichée dans le détail d'une demande
</commit_message>
<xml_diff>
--- a/site/modele-bon-de-commande.docx
+++ b/site/modele-bon-de-commande.docx
@@ -325,40 +325,7 @@
                                 <w:sz w:val="32"/>
                                 <w:szCs w:val="32"/>
                               </w:rPr>
-                              <w:fldChar w:fldCharType="begin"/>
-                            </w:r>
-                            <w:r>
-                              <w:rPr>
-                                <w:spacing w:val="20"/>
-                                <w:sz w:val="32"/>
-                                <w:szCs w:val="32"/>
-                              </w:rPr>
-                              <w:instrText xml:space="preserve"> TIME \@ "d MMMM yyyy" </w:instrText>
-                            </w:r>
-                            <w:r>
-                              <w:rPr>
-                                <w:spacing w:val="20"/>
-                                <w:sz w:val="32"/>
-                                <w:szCs w:val="32"/>
-                              </w:rPr>
-                              <w:fldChar w:fldCharType="separate"/>
-                            </w:r>
-                            <w:r>
-                              <w:rPr>
-                                <w:noProof/>
-                                <w:spacing w:val="20"/>
-                                <w:sz w:val="32"/>
-                                <w:szCs w:val="32"/>
-                              </w:rPr>
-                              <w:t>16 juillet 2026</w:t>
-                            </w:r>
-                            <w:r>
-                              <w:rPr>
-                                <w:spacing w:val="20"/>
-                                <w:sz w:val="32"/>
-                                <w:szCs w:val="32"/>
-                              </w:rPr>
-                              <w:fldChar w:fldCharType="end"/>
+                              <w:t>{date_document}</w:t>
                             </w:r>
                           </w:p>
                         </w:txbxContent>
@@ -403,40 +370,7 @@
                           <w:sz w:val="32"/>
                           <w:szCs w:val="32"/>
                         </w:rPr>
-                        <w:fldChar w:fldCharType="begin"/>
-                      </w:r>
-                      <w:r>
-                        <w:rPr>
-                          <w:spacing w:val="20"/>
-                          <w:sz w:val="32"/>
-                          <w:szCs w:val="32"/>
-                        </w:rPr>
-                        <w:instrText xml:space="preserve"> TIME \@ "d MMMM yyyy" </w:instrText>
-                      </w:r>
-                      <w:r>
-                        <w:rPr>
-                          <w:spacing w:val="20"/>
-                          <w:sz w:val="32"/>
-                          <w:szCs w:val="32"/>
-                        </w:rPr>
-                        <w:fldChar w:fldCharType="separate"/>
-                      </w:r>
-                      <w:r>
-                        <w:rPr>
-                          <w:noProof/>
-                          <w:spacing w:val="20"/>
-                          <w:sz w:val="32"/>
-                          <w:szCs w:val="32"/>
-                        </w:rPr>
-                        <w:t>16 juillet 2026</w:t>
-                      </w:r>
-                      <w:r>
-                        <w:rPr>
-                          <w:spacing w:val="20"/>
-                          <w:sz w:val="32"/>
-                          <w:szCs w:val="32"/>
-                        </w:rPr>
-                        <w:fldChar w:fldCharType="end"/>
+                        <w:t>{date_document}</w:t>
                       </w:r>
                     </w:p>
                   </w:txbxContent>

</xml_diff>